<commit_message>
docs(deck): rework the network policy advisory to upstream Kubernetes and open source (S12)
</commit_message>
<xml_diff>
--- a/lgtm-presentation/network-policy-process-advisory.docx
+++ b/lgtm-presentation/network-policy-process-advisory.docx
@@ -7,7 +7,7 @@
         <w:pStyle w:val="Heading1"/>
       </w:pPr>
       <w:r>
-        <w:t>Network Policy Process — Red Hat Advisory</w:t>
+        <w:t xml:space="preserve">Network Policy Process — Advisory</w:t>
       </w:r>
     </w:p>
     <w:p>
@@ -17,7 +17,7 @@
     </w:p>
     <w:p>
       <w:r>
-        <w:t>on OpenShift, from perimeter-only to developer-owned NetworkPolicies.</w:t>
+        <w:t xml:space="preserve">on Kubernetes, from perimeter-only to developer-owned NetworkPolicies.</w:t>
       </w:r>
     </w:p>
     <w:p>
@@ -30,7 +30,7 @@
     </w:p>
     <w:p>
       <w:r>
-        <w:t>This is Red Hat's recommended approach to building a network policy process</w:t>
+        <w:t xml:space="preserve">This is a recommended approach to building a network policy process</w:t>
       </w:r>
     </w:p>
     <w:p>
@@ -48,7 +48,7 @@
     </w:p>
     <w:p>
       <w:r>
-        <w:t xml:space="preserve">  traditional appliance (Palo Alto, Fortinet, etc.) today.</w:t>
+        <w:t xml:space="preserve">  traditional perimeter firewall appliance today.</w:t>
       </w:r>
     </w:p>
     <w:p>
@@ -56,12 +56,12 @@
         <w:pStyle w:val="ListBullet"/>
       </w:pPr>
       <w:r>
-        <w:t>Wants to shift network segmentation left into the OpenShift cluster using</w:t>
-      </w:r>
-    </w:p>
-    <w:p>
-      <w:r>
-        <w:t xml:space="preserve">  Kubernetes NetworkPolicy, AdminNetworkPolicy, and EgressFirewall.</w:t>
+        <w:t xml:space="preserve">Wants to shift network segmentation left into the Kubernetes cluster using</w:t>
+      </w:r>
+    </w:p>
+    <w:p>
+      <w:r>
+        <w:t xml:space="preserve">  NetworkPolicy, ClusterNetworkPolicy, and egress rules.</w:t>
       </w:r>
     </w:p>
     <w:p>
@@ -100,7 +100,23 @@
     </w:p>
     <w:p>
       <w:r>
-        <w:t>it with the teams and tools they already have.</w:t>
+        <w:t xml:space="preserve">it with the teams and tools they already have. The tools named are upstream</w:t>
+      </w:r>
+    </w:p>
+    <w:p>
+      <w:pPr/>
+      <w:r>
+        <w:t xml:space="preserve">open-source options: a CNI that enforces NetworkPolicy and ClusterNetworkPolicy</w:t>
+      </w:r>
+    </w:p>
+    <w:p>
+      <w:r>
+        <w:t xml:space="preserve">(Calico or Cilium), Kyverno or OPA Gatekeeper for admission policy, Trivy for</w:t>
+      </w:r>
+    </w:p>
+    <w:p>
+      <w:r>
+        <w:t xml:space="preserve">manifest scanning, Falco for runtime detection, and Argo CD for GitOps.</w:t>
       </w:r>
     </w:p>
     <w:p>
@@ -108,7 +124,7 @@
         <w:pStyle w:val="Heading2"/>
       </w:pPr>
       <w:r>
-        <w:t>1. Where customers typically start</w:t>
+        <w:t xml:space="preserve">1. Where organizations typically start</w:t>
       </w:r>
     </w:p>
     <w:p>
@@ -133,12 +149,12 @@
     </w:p>
     <w:p>
       <w:r>
-        <w:t>capacity, and risk tolerance. The phases below are sequential — each builds</w:t>
-      </w:r>
-    </w:p>
-    <w:p>
-      <w:r>
-        <w:t>on the previous — but the pace is agreed upon by the organization.</w:t>
+        <w:t xml:space="preserve">capacity, and risk tolerance. The four phases are sequential, each building</w:t>
+      </w:r>
+    </w:p>
+    <w:p>
+      <w:r>
+        <w:t xml:space="preserve">on the previous, but the pace is agreed upon by the organization.</w:t>
       </w:r>
     </w:p>
     <w:p>
@@ -151,103 +167,123 @@
     </w:p>
     <w:p>
       <w:r>
-        <w:t>Before writing any policy, understand what traffic actually flows today.</w:t>
-      </w:r>
-    </w:p>
-    <w:p>
-      <w:r>
-        <w:t>Red Hat Advanced Cluster Security (ACS) automatically discovers network</w:t>
-      </w:r>
-    </w:p>
-    <w:p>
-      <w:r>
-        <w:t>flows between deployments, namespaces, and external destinations. It builds</w:t>
-      </w:r>
-    </w:p>
-    <w:p>
-      <w:r>
-        <w:t xml:space="preserve">a </w:t>
+        <w:t xml:space="preserve">Before writing any policy, understand what traffic flows today.</w:t>
+      </w:r>
+    </w:p>
+    <w:p>
+      <w:r>
+        <w:t xml:space="preserve">The CNI records the network flows between pods, namespaces, and external</w:t>
+      </w:r>
+    </w:p>
+    <w:p>
+      <w:r>
+        <w:t xml:space="preserve">destinations: Hubble with Cilium (</w:t>
+      </w:r>
+      <w:r>
+        <w:rPr>
+          <w:rFonts w:ascii="Consolas" w:hAnsi="Consolas"/>
+          <w:color w:val="333333"/>
+          <w:sz w:val="18"/>
+        </w:rPr>
+        <w:t xml:space="preserve">hubble observe</w:t>
+      </w:r>
+      <w:r>
+        <w:t xml:space="preserve">), or Calico's flow logs</w:t>
+      </w:r>
+    </w:p>
+    <w:p>
+      <w:r>
+        <w:t xml:space="preserve">(Goldmane, viewed in the Whisker console). Inspektor Gadget's</w:t>
+      </w:r>
+    </w:p>
+    <w:p>
+      <w:r>
+        <w:rPr>
+          <w:rFonts w:ascii="Consolas" w:hAnsi="Consolas"/>
+          <w:color w:val="333333"/>
+          <w:sz w:val="18"/>
+        </w:rPr>
+        <w:t xml:space="preserve">advise_networkpolicy</w:t>
+      </w:r>
+      <w:r>
+        <w:t xml:space="preserve"> gadget records the TCP and UDP traffic of chosen</w:t>
+      </w:r>
+    </w:p>
+    <w:p>
+      <w:r>
+        <w:t xml:space="preserve">namespaces. Together they give a </w:t>
       </w:r>
       <w:r>
         <w:rPr>
           <w:b/>
         </w:rPr>
-        <w:t>network baseline</w:t>
-      </w:r>
-      <w:r>
-        <w:t xml:space="preserve"> — a map of every connection the cluster has seen — and</w:t>
-      </w:r>
-    </w:p>
-    <w:p>
-      <w:r>
-        <w:t xml:space="preserve">renders it in the </w:t>
-      </w:r>
+        <w:t xml:space="preserve">network baseline</w:t>
+      </w:r>
+      <w:r>
+        <w:t xml:space="preserve">, a map of every</w:t>
+      </w:r>
+    </w:p>
+    <w:p>
+      <w:r>
+        <w:t xml:space="preserve">connection the cluster has seen, which becomes the source of truth for what</w:t>
+      </w:r>
+    </w:p>
+    <w:p>
+      <w:r>
+        <w:t xml:space="preserve">traffic is expected.</w:t>
+      </w:r>
+    </w:p>
+    <w:p>
+      <w:r>
+        <w:t>At this stage, nothing is denied. The goal is visibility. The firewall team</w:t>
+      </w:r>
+    </w:p>
+    <w:p>
+      <w:r>
+        <w:t xml:space="preserve">and platform team review the observed flows together and identify:</w:t>
+      </w:r>
+    </w:p>
+    <w:p>
+      <w:pPr>
+        <w:pStyle w:val="ListBullet"/>
+      </w:pPr>
+      <w:r>
+        <w:t>Which services talk to each other (and which shouldn't).</w:t>
+      </w:r>
+    </w:p>
+    <w:p>
+      <w:pPr>
+        <w:pStyle w:val="ListBullet"/>
+      </w:pPr>
+      <w:r>
+        <w:t>Which services make outbound calls to external endpoints.</w:t>
+      </w:r>
+    </w:p>
+    <w:p>
+      <w:pPr>
+        <w:pStyle w:val="ListBullet"/>
+      </w:pPr>
+      <w:r>
+        <w:t>Which connections cross namespace boundaries.</w:t>
+      </w:r>
+    </w:p>
+    <w:p>
+      <w:pPr>
+        <w:pStyle w:val="ListBullet"/>
+      </w:pPr>
+      <w:r>
+        <w:t>Which traffic patterns were previously invisible behind the perimeter.</w:t>
+      </w:r>
+    </w:p>
+    <w:p>
       <w:r>
         <w:rPr>
           <w:b/>
         </w:rPr>
-        <w:t>Network Graph</w:t>
-      </w:r>
-      <w:r>
-        <w:t>. This baseline becomes the source of truth</w:t>
-      </w:r>
-    </w:p>
-    <w:p>
-      <w:r>
-        <w:t>for what traffic is expected.</w:t>
-      </w:r>
-    </w:p>
-    <w:p>
-      <w:r>
-        <w:t>At this stage, nothing is denied. The goal is visibility. The firewall team</w:t>
-      </w:r>
-    </w:p>
-    <w:p>
-      <w:r>
-        <w:t>and platform team review the ACS network graph together and identify:</w:t>
-      </w:r>
-    </w:p>
-    <w:p>
-      <w:pPr>
-        <w:pStyle w:val="ListBullet"/>
-      </w:pPr>
-      <w:r>
-        <w:t>Which services talk to each other (and which shouldn't).</w:t>
-      </w:r>
-    </w:p>
-    <w:p>
-      <w:pPr>
-        <w:pStyle w:val="ListBullet"/>
-      </w:pPr>
-      <w:r>
-        <w:t>Which services make outbound calls to external endpoints.</w:t>
-      </w:r>
-    </w:p>
-    <w:p>
-      <w:pPr>
-        <w:pStyle w:val="ListBullet"/>
-      </w:pPr>
-      <w:r>
-        <w:t>Which connections cross namespace boundaries.</w:t>
-      </w:r>
-    </w:p>
-    <w:p>
-      <w:pPr>
-        <w:pStyle w:val="ListBullet"/>
-      </w:pPr>
-      <w:r>
-        <w:t>Which traffic patterns were previously invisible behind the perimeter.</w:t>
-      </w:r>
-    </w:p>
-    <w:p>
-      <w:r>
-        <w:rPr>
-          <w:b/>
-        </w:rPr>
-        <w:t>What Red Hat typically sees:</w:t>
-      </w:r>
-      <w:r>
-        <w:t xml:space="preserve"> customers are surprised by the volume of</w:t>
+        <w:t xml:space="preserve">What field teams typically see:</w:t>
+      </w:r>
+      <w:r>
+        <w:t xml:space="preserve"> organizations are surprised by the volume of</w:t>
       </w:r>
     </w:p>
     <w:p>
@@ -331,341 +367,393 @@
     </w:p>
     <w:p>
       <w:r>
-        <w:t xml:space="preserve">Simultaneously, use ACS to </w:t>
+        <w:t xml:space="preserve">Simultaneously, </w:t>
       </w:r>
       <w:r>
         <w:rPr>
           <w:b/>
         </w:rPr>
-        <w:t>auto-generate NetworkPolicy YAML</w:t>
-      </w:r>
-      <w:r>
-        <w:t xml:space="preserve"> from the</w:t>
-      </w:r>
-    </w:p>
-    <w:p>
-      <w:r>
-        <w:t>observed baseline. ACS generates a single policy per deployment (named</w:t>
-      </w:r>
-    </w:p>
-    <w:p>
+        <w:t xml:space="preserve">generate NetworkPolicy YAML</w:t>
+      </w:r>
+      <w:r>
+        <w:t xml:space="preserve"> from the observed baseline.</w:t>
+      </w:r>
+    </w:p>
+    <w:p>
+      <w:r>
+        <w:t xml:space="preserve">Inspektor Gadget's </w:t>
+      </w:r>
+      <w:r>
+        <w:rPr>
+          <w:rFonts w:ascii="Consolas" w:hAnsi="Consolas"/>
+          <w:color w:val="333333"/>
+          <w:sz w:val="18"/>
+        </w:rPr>
+        <w:t xml:space="preserve">advise_networkpolicy</w:t>
+      </w:r>
+      <w:r>
+        <w:t xml:space="preserve"> writes one policy per workload, with</w:t>
+      </w:r>
+    </w:p>
+    <w:p>
+      <w:r>
+        <w:t xml:space="preserve">ingress and egress rules based on the observed peers (Kubernetes NetworkPolicy,</w:t>
+      </w:r>
+    </w:p>
+    <w:p>
+      <w:r>
+        <w:t xml:space="preserve">or CiliumNetworkPolicy on Cilium). These generated policies are a starting</w:t>
+      </w:r>
+    </w:p>
+    <w:p>
+      <w:r>
+        <w:t xml:space="preserve">point — they capture what traffic </w:t>
+      </w:r>
+      <w:r>
+        <w:rPr>
+          <w:i/>
+        </w:rPr>
+        <w:t>did</w:t>
+      </w:r>
+      <w:r>
+        <w:t xml:space="preserve"> flow, not what traffic </w:t>
+      </w:r>
+      <w:r>
+        <w:rPr>
+          <w:i/>
+        </w:rPr>
+        <w:t>should</w:t>
+      </w:r>
+      <w:r>
+        <w:t xml:space="preserve"> flow.</w:t>
+      </w:r>
+    </w:p>
+    <w:p>
+      <w:r>
+        <w:t xml:space="preserve">On Calico, a StagedNetworkPolicy shows in the flow logs what a policy would</w:t>
+      </w:r>
+    </w:p>
+    <w:p>
+      <w:r>
+        <w:t xml:space="preserve">deny before it is enforced.</w:t>
+      </w:r>
+    </w:p>
+    <w:p>
+      <w:r>
+        <w:t>The platform team reviews the generated policies, removes any connections</w:t>
+      </w:r>
+    </w:p>
+    <w:p>
+      <w:r>
+        <w:t>that should not have existed (the audit value of this step is significant),</w:t>
+      </w:r>
+    </w:p>
+    <w:p>
+      <w:r>
+        <w:t>and applies the cleaned-up policies alongside the default-deny.</w:t>
+      </w:r>
+    </w:p>
+    <w:p>
+      <w:r>
+        <w:rPr>
+          <w:b/>
+        </w:rPr>
+        <w:t xml:space="preserve">What field teams typically see:</w:t>
+      </w:r>
+      <w:r>
+        <w:t xml:space="preserve"> the first default-deny rollout in a non-prod</w:t>
+      </w:r>
+    </w:p>
+    <w:p>
+      <w:r>
+        <w:t>namespace immediately reveals undocumented dependencies — a monitoring agent</w:t>
+      </w:r>
+    </w:p>
+    <w:p>
+      <w:r>
+        <w:t>that scrapes every pod, a legacy batch job that connects to an external</w:t>
+      </w:r>
+    </w:p>
+    <w:p>
+      <w:r>
+        <w:t>database, a sidecar that phones home to a SaaS endpoint. Discovering these</w:t>
+      </w:r>
+    </w:p>
+    <w:p>
+      <w:r>
+        <w:t>in dev or test is the point.</w:t>
+      </w:r>
+    </w:p>
+    <w:p>
+      <w:pPr>
+        <w:pStyle w:val="Heading3"/>
+      </w:pPr>
+      <w:r>
+        <w:t>Phase 3 — Guardrails</w:t>
+      </w:r>
+    </w:p>
+    <w:p>
+      <w:r>
+        <w:t>With baseline policies in place, the platform team introduces cluster-scoped</w:t>
+      </w:r>
+    </w:p>
+    <w:p>
+      <w:r>
+        <w:t xml:space="preserve">guardrails using the upstream </w:t>
+      </w:r>
+      <w:r>
+        <w:rPr>
+          <w:b/>
+        </w:rPr>
+        <w:t xml:space="preserve">ClusterNetworkPolicy (CNP)</w:t>
+      </w:r>
+      <w:r>
+        <w:t xml:space="preserve"> API, in its</w:t>
+      </w:r>
+    </w:p>
+    <w:p>
+      <w:r>
+        <w:rPr>
+          <w:b/>
+        </w:rPr>
+        <w:t xml:space="preserve">Admin</w:t>
+      </w:r>
+      <w:r>
+        <w:t xml:space="preserve"> and </w:t>
+      </w:r>
+      <w:r>
+        <w:rPr>
+          <w:b/>
+        </w:rPr>
+        <w:t xml:space="preserve">Baseline</w:t>
+      </w:r>
+      <w:r>
+        <w:t xml:space="preserve"> tiers.</w:t>
+      </w:r>
+    </w:p>
+    <w:p>
+      <w:r>
+        <w:t>These are the policies the platform team owns — they cannot be overridden by</w:t>
+      </w:r>
+    </w:p>
+    <w:p>
+      <w:r>
+        <w:t>developers, and they establish the security boundaries that all applications</w:t>
+      </w:r>
+    </w:p>
+    <w:p>
+      <w:r>
+        <w:t>inherit.</w:t>
+      </w:r>
+    </w:p>
+    <w:p>
+      <w:pPr>
+        <w:pStyle w:val="Heading3"/>
+      </w:pPr>
+      <w:r>
+        <w:t>Phase 4 — Developer ownership (ongoing)</w:t>
+      </w:r>
+    </w:p>
+    <w:p>
+      <w:r>
+        <w:t>App teams begin authoring and owning their own namespace-scoped</w:t>
+      </w:r>
+    </w:p>
+    <w:p>
+      <w:r>
+        <w:t>NetworkPolicies. They do this via pull request, with CI validation and</w:t>
+      </w:r>
+    </w:p>
+    <w:p>
+      <w:r>
+        <w:t xml:space="preserve">platform team review. The CI/CD flow section describes</w:t>
+      </w:r>
+    </w:p>
+    <w:p>
+      <w:r>
+        <w:t>this workflow in detail.</w:t>
+      </w:r>
+    </w:p>
+    <w:p>
+      <w:pPr>
+        <w:pStyle w:val="Heading2"/>
+      </w:pPr>
+      <w:r>
+        <w:t>2. The three-tier policy model</w:t>
+      </w:r>
+    </w:p>
+    <w:p>
+      <w:r>
+        <w:t xml:space="preserve">A CNI that implements ClusterNetworkPolicy evaluates traffic against three</w:t>
+      </w:r>
+    </w:p>
+    <w:p>
+      <w:r>
+        <w:t>tiers of policy, in order. Understanding this model is critical — it</w:t>
+      </w:r>
+    </w:p>
+    <w:p>
+      <w:r>
+        <w:t>determines who controls what and where overrides are possible.</w:t>
+      </w:r>
+    </w:p>
+    <w:p>
+      <w:pPr>
+        <w:pStyle w:val="Heading3"/>
+      </w:pPr>
+      <w:r>
+        <w:t xml:space="preserve">Tier 1 — ClusterNetworkPolicy, Admin tier</w:t>
+      </w:r>
+    </w:p>
+    <w:p>
+      <w:pPr>
+        <w:pStyle w:val="ListBullet"/>
+      </w:pPr>
+      <w:r>
+        <w:rPr>
+          <w:b/>
+        </w:rPr>
+        <w:t>Scope:</w:t>
+      </w:r>
+      <w:r>
+        <w:t xml:space="preserve"> cluster-wide (not namespace-scoped)</w:t>
+      </w:r>
+    </w:p>
+    <w:p>
+      <w:pPr>
+        <w:pStyle w:val="ListBullet"/>
+      </w:pPr>
+      <w:r>
+        <w:rPr>
+          <w:b/>
+        </w:rPr>
+        <w:t>Controlled by:</w:t>
+      </w:r>
+      <w:r>
+        <w:t xml:space="preserve"> platform / infrastructure team</w:t>
+      </w:r>
+    </w:p>
+    <w:p>
+      <w:pPr>
+        <w:pStyle w:val="ListBullet"/>
+      </w:pPr>
+      <w:r>
+        <w:rPr>
+          <w:b/>
+        </w:rPr>
+        <w:t xml:space="preserve">Priority:</w:t>
+      </w:r>
+      <w:r>
+        <w:t xml:space="preserve"> 0 (highest) to 1000 (lowest)</w:t>
+      </w:r>
+    </w:p>
+    <w:p>
+      <w:pPr>
+        <w:pStyle w:val="ListBullet"/>
+      </w:pPr>
+      <w:r>
+        <w:rPr>
+          <w:b/>
+        </w:rPr>
+        <w:t xml:space="preserve">Actions:</w:t>
+      </w:r>
+      <w:r>
+        <w:t xml:space="preserve"> Accept, Deny, or </w:t>
+      </w:r>
+      <w:r>
+        <w:rPr>
+          <w:b/>
+        </w:rPr>
+        <w:t xml:space="preserve">Pass</w:t>
+      </w:r>
+      <w:r>
+        <w:t xml:space="preserve"> (hand evaluation to the next tier)</w:t>
+      </w:r>
+    </w:p>
+    <w:p>
+      <w:pPr>
+        <w:pStyle w:val="ListBullet"/>
+      </w:pPr>
+      <w:r>
+        <w:rPr>
+          <w:b/>
+        </w:rPr>
+        <w:t xml:space="preserve">Override:</w:t>
+      </w:r>
+      <w:r>
+        <w:t xml:space="preserve"> cannot be overridden by NetworkPolicy or the Baseline tier</w:t>
+      </w:r>
+    </w:p>
+    <w:p>
+      <w:pPr>
+        <w:pStyle w:val="ListBullet"/>
+      </w:pPr>
+      <w:r>
+        <w:rPr>
+          <w:b/>
+        </w:rPr>
+        <w:t xml:space="preserve">Status:</w:t>
+      </w:r>
+      <w:r>
+        <w:t xml:space="preserve"> </w:t>
+      </w:r>
       <w:r>
         <w:rPr>
           <w:rFonts w:ascii="Consolas" w:hAnsi="Consolas"/>
           <w:color w:val="CC0000"/>
           <w:sz w:val="20"/>
         </w:rPr>
-        <w:t>stackrox-generated-&lt;deployment&gt;</w:t>
-      </w:r>
-      <w:r>
-        <w:t>), with ingress rules based on observed</w:t>
-      </w:r>
-    </w:p>
-    <w:p>
-      <w:r>
-        <w:t>source pods and namespace selectors. These generated policies are a starting</w:t>
-      </w:r>
-    </w:p>
-    <w:p>
-      <w:r>
-        <w:t xml:space="preserve">point — they capture what traffic </w:t>
-      </w:r>
-      <w:r>
-        <w:rPr>
-          <w:i/>
-        </w:rPr>
-        <w:t>did</w:t>
-      </w:r>
-      <w:r>
-        <w:t xml:space="preserve"> flow, not what traffic </w:t>
-      </w:r>
-      <w:r>
-        <w:rPr>
-          <w:i/>
-        </w:rPr>
-        <w:t>should</w:t>
-      </w:r>
-      <w:r>
-        <w:t xml:space="preserve"> flow.</w:t>
-      </w:r>
-    </w:p>
-    <w:p>
-      <w:r>
-        <w:t>The platform team reviews the generated policies, removes any connections</w:t>
-      </w:r>
-    </w:p>
-    <w:p>
-      <w:r>
-        <w:t>that should not have existed (the audit value of this step is significant),</w:t>
-      </w:r>
-    </w:p>
-    <w:p>
-      <w:r>
-        <w:t>and applies the cleaned-up policies alongside the default-deny.</w:t>
-      </w:r>
-    </w:p>
-    <w:p>
+        <w:t xml:space="preserve">policy.networking.k8s.io/v1alpha2</w:t>
+      </w:r>
+      <w:r>
+        <w:t xml:space="preserve"> (alpha, network-policy-api v0.2.0); enforced by Calico 3.32 and later, and by Cilium 1.20 when enabled</w:t>
+      </w:r>
+    </w:p>
+    <w:p>
+      <w:r>
+        <w:t xml:space="preserve">The Admin tier is where the platform team enforces non-negotiable rules: deny</w:t>
+      </w:r>
+    </w:p>
+    <w:p>
+      <w:r>
+        <w:t xml:space="preserve">traffic to the control plane from application namespaces, accept monitoring</w:t>
+      </w:r>
+    </w:p>
+    <w:p>
+      <w:r>
+        <w:t xml:space="preserve">agents scraping all pods, deny cross-environment traffic (dev → prod). A </w:t>
+      </w:r>
       <w:r>
         <w:rPr>
           <w:b/>
         </w:rPr>
-        <w:t>What Red Hat typically sees:</w:t>
-      </w:r>
-      <w:r>
-        <w:t xml:space="preserve"> the first default-deny rollout in a non-prod</w:t>
-      </w:r>
-    </w:p>
-    <w:p>
-      <w:r>
-        <w:t>namespace immediately reveals undocumented dependencies — a monitoring agent</w:t>
-      </w:r>
-    </w:p>
-    <w:p>
-      <w:r>
-        <w:t>that scrapes every pod, a legacy batch job that connects to an external</w:t>
-      </w:r>
-    </w:p>
-    <w:p>
-      <w:r>
-        <w:t>database, a sidecar that phones home to a SaaS endpoint. Discovering these</w:t>
-      </w:r>
-    </w:p>
-    <w:p>
-      <w:r>
-        <w:t>in dev or test is the point.</w:t>
-      </w:r>
-    </w:p>
-    <w:p>
-      <w:pPr>
-        <w:pStyle w:val="Heading3"/>
-      </w:pPr>
-      <w:r>
-        <w:t>Phase 3 — Guardrails</w:t>
-      </w:r>
-    </w:p>
-    <w:p>
-      <w:r>
-        <w:t>With baseline policies in place, the platform team introduces cluster-scoped</w:t>
-      </w:r>
-    </w:p>
-    <w:p>
-      <w:r>
-        <w:t xml:space="preserve">guardrails using OpenShift's </w:t>
-      </w:r>
+        <w:t xml:space="preserve">Pass</w:t>
+      </w:r>
+    </w:p>
+    <w:p>
+      <w:r>
+        <w:t>rule explicitly delegates the decision to the next tier (NetworkPolicy),</w:t>
+      </w:r>
+    </w:p>
+    <w:p>
+      <w:r>
+        <w:t>which is how the platform team says "app teams, this one is yours to decide."</w:t>
+      </w:r>
+    </w:p>
+    <w:p>
       <w:r>
         <w:rPr>
           <w:b/>
         </w:rPr>
-        <w:t>AdminNetworkPolicy (ANP)</w:t>
-      </w:r>
-      <w:r>
-        <w:t xml:space="preserve"> and</w:t>
-      </w:r>
-    </w:p>
-    <w:p>
-      <w:r>
-        <w:rPr>
-          <w:b/>
-        </w:rPr>
-        <w:t>BaselineAdminNetworkPolicy (BANP)</w:t>
-      </w:r>
-      <w:r>
-        <w:t>.</w:t>
-      </w:r>
-    </w:p>
-    <w:p>
-      <w:r>
-        <w:t>These are the policies the platform team owns — they cannot be overridden by</w:t>
-      </w:r>
-    </w:p>
-    <w:p>
-      <w:r>
-        <w:t>developers, and they establish the security boundaries that all applications</w:t>
-      </w:r>
-    </w:p>
-    <w:p>
-      <w:r>
-        <w:t>inherit.</w:t>
-      </w:r>
-    </w:p>
-    <w:p>
-      <w:pPr>
-        <w:pStyle w:val="Heading3"/>
-      </w:pPr>
-      <w:r>
-        <w:t>Phase 4 — Developer ownership (ongoing)</w:t>
-      </w:r>
-    </w:p>
-    <w:p>
-      <w:r>
-        <w:t>App teams begin authoring and owning their own namespace-scoped</w:t>
-      </w:r>
-    </w:p>
-    <w:p>
-      <w:r>
-        <w:t>NetworkPolicies. They do this via pull request, with CI validation and</w:t>
-      </w:r>
-    </w:p>
-    <w:p>
-      <w:r>
-        <w:t>platform team review. The process section later in this document describes</w:t>
-      </w:r>
-    </w:p>
-    <w:p>
-      <w:r>
-        <w:t>this workflow in detail.</w:t>
-      </w:r>
-    </w:p>
-    <w:p>
-      <w:pPr>
-        <w:pStyle w:val="Heading2"/>
-      </w:pPr>
-      <w:r>
-        <w:t>2. The three-tier policy model</w:t>
-      </w:r>
-    </w:p>
-    <w:p>
-      <w:r>
-        <w:t>OpenShift's OVN-Kubernetes network plugin evaluates traffic against three</w:t>
-      </w:r>
-    </w:p>
-    <w:p>
-      <w:r>
-        <w:t>tiers of policy, in order. Understanding this model is critical — it</w:t>
-      </w:r>
-    </w:p>
-    <w:p>
-      <w:r>
-        <w:t>determines who controls what and where overrides are possible.</w:t>
-      </w:r>
-    </w:p>
-    <w:p>
-      <w:pPr>
-        <w:pStyle w:val="Heading3"/>
-      </w:pPr>
-      <w:r>
-        <w:t>Tier 1 — AdminNetworkPolicy (ANP)</w:t>
-      </w:r>
-    </w:p>
-    <w:p>
-      <w:pPr>
-        <w:pStyle w:val="ListBullet"/>
-      </w:pPr>
-      <w:r>
-        <w:rPr>
-          <w:b/>
-        </w:rPr>
-        <w:t>Scope:</w:t>
-      </w:r>
-      <w:r>
-        <w:t xml:space="preserve"> cluster-wide (not namespace-scoped)</w:t>
-      </w:r>
-    </w:p>
-    <w:p>
-      <w:pPr>
-        <w:pStyle w:val="ListBullet"/>
-      </w:pPr>
-      <w:r>
-        <w:rPr>
-          <w:b/>
-        </w:rPr>
-        <w:t>Controlled by:</w:t>
-      </w:r>
-      <w:r>
-        <w:t xml:space="preserve"> platform / infrastructure team</w:t>
-      </w:r>
-    </w:p>
-    <w:p>
-      <w:pPr>
-        <w:pStyle w:val="ListBullet"/>
-      </w:pPr>
-      <w:r>
-        <w:rPr>
-          <w:b/>
-        </w:rPr>
-        <w:t>Priority:</w:t>
-      </w:r>
-      <w:r>
-        <w:t xml:space="preserve"> 0 (highest) to 99 (lowest)</w:t>
-      </w:r>
-    </w:p>
-    <w:p>
-      <w:pPr>
-        <w:pStyle w:val="ListBullet"/>
-      </w:pPr>
-      <w:r>
-        <w:rPr>
-          <w:b/>
-        </w:rPr>
-        <w:t>Actions:</w:t>
-      </w:r>
-      <w:r>
-        <w:t xml:space="preserve"> Allow, Deny, or </w:t>
-      </w:r>
-      <w:r>
-        <w:rPr>
-          <w:b/>
-        </w:rPr>
-        <w:t>Pass</w:t>
-      </w:r>
-      <w:r>
-        <w:t xml:space="preserve"> (hand evaluation to the next tier)</w:t>
-      </w:r>
-    </w:p>
-    <w:p>
-      <w:pPr>
-        <w:pStyle w:val="ListBullet"/>
-      </w:pPr>
-      <w:r>
-        <w:rPr>
-          <w:b/>
-        </w:rPr>
-        <w:t>Override:</w:t>
-      </w:r>
-      <w:r>
-        <w:t xml:space="preserve"> cannot be overridden by NetworkPolicy or BANP</w:t>
-      </w:r>
-    </w:p>
-    <w:p>
-      <w:r>
-        <w:t>ANP is where the platform team enforces non-negotiable rules: deny traffic</w:t>
-      </w:r>
-    </w:p>
-    <w:p>
-      <w:r>
-        <w:t>to the control plane from application namespaces, allow monitoring agents</w:t>
-      </w:r>
-    </w:p>
-    <w:p>
-      <w:r>
-        <w:t xml:space="preserve">to scrape all pods, deny cross-environment traffic (dev → prod). A </w:t>
-      </w:r>
-      <w:r>
-        <w:rPr>
-          <w:b/>
-        </w:rPr>
-        <w:t>Pass</w:t>
-      </w:r>
-    </w:p>
-    <w:p>
-      <w:r>
-        <w:t>rule explicitly delegates the decision to the next tier (NetworkPolicy),</w:t>
-      </w:r>
-    </w:p>
-    <w:p>
-      <w:r>
-        <w:t>which is how the platform team says "app teams, this one is yours to decide."</w:t>
-      </w:r>
-    </w:p>
-    <w:p>
-      <w:r>
-        <w:rPr>
-          <w:b/>
-        </w:rPr>
-        <w:t>Critical caution:</w:t>
-      </w:r>
-      <w:r>
-        <w:t xml:space="preserve"> an ANP with an empty namespace selector (</w:t>
+        <w:t xml:space="preserve">Critical caution:</w:t>
+      </w:r>
+      <w:r>
+        <w:t xml:space="preserve"> an Admin-tier policy with an empty namespace selector</w:t>
+      </w:r>
+    </w:p>
+    <w:p>
+      <w:r>
+        <w:t xml:space="preserve">(</w:t>
       </w:r>
       <w:r>
         <w:rPr>
@@ -673,18 +761,16 @@
           <w:color w:val="CC0000"/>
           <w:sz w:val="20"/>
         </w:rPr>
-        <w:t>{}</w:t>
-      </w:r>
-      <w:r>
-        <w:t>) matches</w:t>
-      </w:r>
-    </w:p>
-    <w:p>
+        <w:t xml:space="preserve">{}</w:t>
+      </w:r>
+      <w:r>
+        <w:t xml:space="preserve">) matches </w:t>
+      </w:r>
       <w:r>
         <w:rPr>
           <w:i/>
         </w:rPr>
-        <w:t>all</w:t>
+        <w:t xml:space="preserve">all</w:t>
       </w:r>
       <w:r>
         <w:t xml:space="preserve"> namespaces, including </w:t>
@@ -695,26 +781,20 @@
           <w:color w:val="CC0000"/>
           <w:sz w:val="20"/>
         </w:rPr>
-        <w:t>openshift-*</w:t>
-      </w:r>
-      <w:r>
-        <w:t xml:space="preserve"> and </w:t>
-      </w:r>
-      <w:r>
-        <w:rPr>
-          <w:rFonts w:ascii="Consolas" w:hAnsi="Consolas"/>
-          <w:color w:val="CC0000"/>
-          <w:sz w:val="20"/>
-        </w:rPr>
-        <w:t>kube-system</w:t>
-      </w:r>
-      <w:r>
-        <w:t>. Use workload-</w:t>
-      </w:r>
-    </w:p>
-    <w:p>
-      <w:r>
-        <w:t>specific label selectors. An overly broad ANP can lock the cluster.</w:t>
+        <w:t xml:space="preserve">kube-system</w:t>
+      </w:r>
+      <w:r>
+        <w:t xml:space="preserve"> and the CNI's own</w:t>
+      </w:r>
+    </w:p>
+    <w:p>
+      <w:r>
+        <w:t xml:space="preserve">namespaces. Use workload-specific label selectors. An overly broad Admin-tier</w:t>
+      </w:r>
+    </w:p>
+    <w:p>
+      <w:r>
+        <w:t xml:space="preserve">policy can lock the cluster.</w:t>
       </w:r>
     </w:p>
     <w:p>
@@ -761,10 +841,10 @@
         <w:rPr>
           <w:b/>
         </w:rPr>
-        <w:t>Override:</w:t>
-      </w:r>
-      <w:r>
-        <w:t xml:space="preserve"> can be overridden by ANP (which takes precedence)</w:t>
+        <w:t xml:space="preserve">Override:</w:t>
+      </w:r>
+      <w:r>
+        <w:t xml:space="preserve"> can be overridden by the Admin tier (which takes precedence)</w:t>
       </w:r>
     </w:p>
     <w:p>
@@ -779,12 +859,12 @@
     </w:p>
     <w:p>
       <w:r>
-        <w:t>which ports. Traffic that matches an ANP Allow or Deny rule never reaches</w:t>
-      </w:r>
-    </w:p>
-    <w:p>
-      <w:r>
-        <w:t>this tier — it is only evaluated if the ANP passed the traffic through.</w:t>
+        <w:t xml:space="preserve">which ports. Traffic that matches an Admin-tier Accept or Deny rule never reaches</w:t>
+      </w:r>
+    </w:p>
+    <w:p>
+      <w:r>
+        <w:t xml:space="preserve">this tier; it is evaluated unless an Admin-tier rule accepted or denied the traffic.</w:t>
       </w:r>
     </w:p>
     <w:p>
@@ -792,7 +872,7 @@
         <w:pStyle w:val="Heading3"/>
       </w:pPr>
       <w:r>
-        <w:t>Tier 3 — BaselineAdminNetworkPolicy (BANP)</w:t>
+        <w:t xml:space="preserve">Tier 3 — ClusterNetworkPolicy, Baseline tier</w:t>
       </w:r>
     </w:p>
     <w:p>
@@ -803,10 +883,10 @@
         <w:rPr>
           <w:b/>
         </w:rPr>
-        <w:t>Scope:</w:t>
-      </w:r>
-      <w:r>
-        <w:t xml:space="preserve"> cluster-wide (singleton — only one BANP exists per cluster)</w:t>
+        <w:t xml:space="preserve">Scope:</w:t>
+      </w:r>
+      <w:r>
+        <w:t xml:space="preserve"> cluster-wide (one default-deny policy is the recommended shape)</w:t>
       </w:r>
     </w:p>
     <w:p>
@@ -831,10 +911,10 @@
         <w:rPr>
           <w:b/>
         </w:rPr>
-        <w:t>Actions:</w:t>
-      </w:r>
-      <w:r>
-        <w:t xml:space="preserve"> Allow or Deny (no Pass)</w:t>
+        <w:t xml:space="preserve">Actions:</w:t>
+      </w:r>
+      <w:r>
+        <w:t xml:space="preserve"> Deny for the safety net, Accept for cluster-wide defaults such as DNS</w:t>
       </w:r>
     </w:p>
     <w:p>
@@ -862,22 +942,22 @@
     </w:p>
     <w:p>
       <w:r>
-        <w:t>BANP is the safety net. It catches traffic that was passed by the ANP and</w:t>
-      </w:r>
-    </w:p>
-    <w:p>
-      <w:r>
-        <w:t>not matched by any NetworkPolicy. The recommended use is **default-deny at</w:t>
-      </w:r>
-    </w:p>
-    <w:p>
-      <w:r>
-        <w:t>the BANP tier** — if no ANP rule and no NetworkPolicy allows it, BANP denies</w:t>
-      </w:r>
-    </w:p>
-    <w:p>
-      <w:r>
-        <w:t>it. This means that a namespace with no NetworkPolicies at all still has a</w:t>
+        <w:t xml:space="preserve">The Baseline tier is the safety net. It decides traffic that no Admin-tier rule</w:t>
+      </w:r>
+    </w:p>
+    <w:p>
+      <w:r>
+        <w:t xml:space="preserve">accepted or denied and no NetworkPolicy covers. The recommended use is **default-deny at</w:t>
+      </w:r>
+    </w:p>
+    <w:p>
+      <w:r>
+        <w:t xml:space="preserve">the Baseline tier**: if no Admin-tier rule and no NetworkPolicy allows it, the</w:t>
+      </w:r>
+    </w:p>
+    <w:p>
+      <w:r>
+        <w:t xml:space="preserve">Baseline tier denies it. This means that a namespace with no NetworkPolicies at all still has a</w:t>
       </w:r>
     </w:p>
     <w:p>
@@ -888,6 +968,37 @@
     <w:p>
       <w:r>
         <w:t>default-deny policy themselves.</w:t>
+      </w:r>
+    </w:p>
+    <w:p>
+      <w:r>
+        <w:t xml:space="preserve">The earlier releases of the API split these two tiers into</w:t>
+      </w:r>
+    </w:p>
+    <w:p>
+      <w:r>
+        <w:t xml:space="preserve">AdminNetworkPolicy and BaselineAdminNetworkPolicy (</w:t>
+      </w:r>
+      <w:r>
+        <w:rPr>
+          <w:rFonts w:ascii="Consolas" w:hAnsi="Consolas"/>
+          <w:color w:val="333333"/>
+          <w:sz w:val="18"/>
+        </w:rPr>
+        <w:t xml:space="preserve">v1alpha1</w:t>
+      </w:r>
+      <w:r>
+        <w:t xml:space="preserve">). Upstream now</w:t>
+      </w:r>
+    </w:p>
+    <w:p>
+      <w:r>
+        <w:t xml:space="preserve">lists them as previous APIs, and Calico 3.32 no longer enforces them, so new</w:t>
+      </w:r>
+    </w:p>
+    <w:p>
+      <w:r>
+        <w:t xml:space="preserve">policies use ClusterNetworkPolicy.</w:t>
       </w:r>
     </w:p>
     <w:p>
@@ -908,7 +1019,7 @@
           <w:color w:val="666666"/>
           <w:sz w:val="20"/>
         </w:rPr>
-        <w:t>Diagram: advisory-tier-evaluation — OVN-Kubernetes three-tier policy evaluation</w:t>
+        <w:t xml:space="preserve">Diagram: advisory-tier-evaluation — ClusterNetworkPolicy three-tier evaluation</w:t>
       </w:r>
     </w:p>
     <w:p>
@@ -968,7 +1079,7 @@
         <w:rPr>
           <w:b/>
         </w:rPr>
-        <w:t>The value proposition for the customer:</w:t>
+        <w:t xml:space="preserve">The value proposition for the organization:</w:t>
       </w:r>
       <w:r>
         <w:t xml:space="preserve"> the platform team controls tiers</w:t>
@@ -981,7 +1092,7 @@
     </w:p>
     <w:p>
       <w:r>
-        <w:t>policies). Even if a developer writes no NetworkPolicies at all, the BANP</w:t>
+        <w:t xml:space="preserve">policies). Even if a developer writes no NetworkPolicies at all, the Baseline</w:t>
       </w:r>
     </w:p>
     <w:p>
@@ -1019,7 +1130,7 @@
     </w:p>
     <w:p>
       <w:r>
-        <w:t>unrealistic at the start. Red Hat recommends four complementary approaches:</w:t>
+        <w:t xml:space="preserve">unrealistic at the start. Four complementary approaches close the gap:</w:t>
       </w:r>
     </w:p>
     <w:p>
@@ -1027,12 +1138,28 @@
         <w:pStyle w:val="Heading3"/>
       </w:pPr>
       <w:r>
-        <w:t>a) ACS-generated baselines — developers review, not author</w:t>
-      </w:r>
-    </w:p>
-    <w:p>
-      <w:r>
-        <w:t>ACS observes actual traffic for a configurable window, then generates</w:t>
+        <w:t xml:space="preserve">a) Generated baselines — developers review, not author</w:t>
+      </w:r>
+    </w:p>
+    <w:p>
+      <w:r>
+        <w:t xml:space="preserve">Inspektor Gadget's </w:t>
+      </w:r>
+      <w:r>
+        <w:rPr>
+          <w:rFonts w:ascii="Consolas" w:hAnsi="Consolas"/>
+          <w:color w:val="333333"/>
+          <w:sz w:val="18"/>
+        </w:rPr>
+        <w:t xml:space="preserve">advise_networkpolicy</w:t>
+      </w:r>
+      <w:r>
+        <w:t xml:space="preserve"> observes traffic for a chosen window,</w:t>
+      </w:r>
+    </w:p>
+    <w:p>
+      <w:r>
+        <w:t xml:space="preserve">then generates</w:t>
       </w:r>
     </w:p>
     <w:p>
@@ -1203,12 +1330,12 @@
         <w:pStyle w:val="Heading3"/>
       </w:pPr>
       <w:r>
-        <w:t>c) BANP as a safety net</w:t>
-      </w:r>
-    </w:p>
-    <w:p>
-      <w:r>
-        <w:t>With a BANP configured to deny traffic that no other policy allows, a</w:t>
+        <w:t xml:space="preserve">c) The Baseline tier as a safety net</w:t>
+      </w:r>
+    </w:p>
+    <w:p>
+      <w:r>
+        <w:t xml:space="preserve">With a Baseline-tier policy that denies traffic no other policy allows, a</w:t>
       </w:r>
     </w:p>
     <w:p>
@@ -1259,7 +1386,7 @@
         <w:pStyle w:val="ListBullet"/>
       </w:pPr>
       <w:r>
-        <w:t>A default-deny NetworkPolicy</w:t>
+        <w:t xml:space="preserve">A default-deny NetworkPolicy (a Kyverno generate rule can create it for every new namespace)</w:t>
       </w:r>
     </w:p>
     <w:p>
@@ -1267,7 +1394,7 @@
         <w:pStyle w:val="ListBullet"/>
       </w:pPr>
       <w:r>
-        <w:t>An EgressFirewall allowing only approved external destinations</w:t>
+        <w:t xml:space="preserve">Egress rules allowing only approved external destinations</w:t>
       </w:r>
     </w:p>
     <w:p>
@@ -1457,44 +1584,10 @@
           <w:color w:val="CC0000"/>
           <w:sz w:val="20"/>
         </w:rPr>
-        <w:t>oc apply --dry-run=client</w:t>
-      </w:r>
-      <w:r>
-        <w:t xml:space="preserve"> (valid YAML, correct API version)</w:t>
-      </w:r>
-    </w:p>
-    <w:p>
-      <w:pPr>
-        <w:pStyle w:val="ListBullet"/>
-      </w:pPr>
-      <w:r>
-        <w:t>Policy lint — conftest / kyverno CLI (organizational rules: no allow-all,</w:t>
-      </w:r>
-    </w:p>
-    <w:p>
-      <w:r>
-        <w:t xml:space="preserve">     required labels, port range limits)</w:t>
-      </w:r>
-    </w:p>
-    <w:p>
-      <w:pPr>
-        <w:pStyle w:val="ListBullet"/>
-      </w:pPr>
-      <w:r>
-        <w:t>ACS build-time — validate against known baselines and flag policies that</w:t>
-      </w:r>
-    </w:p>
-    <w:p>
-      <w:r>
-        <w:t xml:space="preserve">     would allow traffic outside the baseline</w:t>
-      </w:r>
-    </w:p>
-    <w:p>
-      <w:pPr>
-        <w:pStyle w:val="ListBullet"/>
-      </w:pPr>
-      <w:r>
-        <w:t xml:space="preserve">Dry-run apply — </w:t>
+        <w:t xml:space="preserve">kubeconform</w:t>
+      </w:r>
+      <w:r>
+        <w:t xml:space="preserve"> and </w:t>
       </w:r>
       <w:r>
         <w:rPr>
@@ -1502,261 +1595,345 @@
           <w:color w:val="CC0000"/>
           <w:sz w:val="20"/>
         </w:rPr>
-        <w:t>oc apply --dry-run=server</w:t>
-      </w:r>
-      <w:r>
-        <w:t xml:space="preserve"> against a staging cluster</w:t>
-      </w:r>
-    </w:p>
-    <w:p>
-      <w:r>
-        <w:t xml:space="preserve">     (catches admission denials, quota issues)</w:t>
-      </w:r>
-    </w:p>
-    <w:p>
-      <w:pPr>
-        <w:pStyle w:val="ListNumber"/>
-      </w:pPr>
+        <w:t xml:space="preserve">kubectl apply --dry-run=client</w:t>
+      </w:r>
+      <w:r>
+        <w:t xml:space="preserve"> (valid YAML, correct API version)</w:t>
+      </w:r>
+    </w:p>
+    <w:p>
+      <w:pPr>
+        <w:pStyle w:val="ListBullet"/>
+      </w:pPr>
+      <w:r>
+        <w:t xml:space="preserve">Policy lint — conftest / </w:t>
+      </w:r>
       <w:r>
         <w:rPr>
-          <w:b/>
+          <w:rFonts w:ascii="Consolas" w:hAnsi="Consolas"/>
+          <w:color w:val="CC0000"/>
+          <w:sz w:val="20"/>
         </w:rPr>
-        <w:t>Platform / security team reviews the PR</w:t>
-      </w:r>
-      <w:r>
-        <w:t xml:space="preserve"> — CODEOWNERS enforces: app</w:t>
-      </w:r>
-    </w:p>
-    <w:p>
-      <w:r>
-        <w:t xml:space="preserve">   team authors NetworkPolicies (platform reviews), platform authors</w:t>
-      </w:r>
-    </w:p>
-    <w:p>
-      <w:r>
-        <w:t xml:space="preserve">   ANP/BANP/EgressFirewall (firewall/security reviews).</w:t>
-      </w:r>
-    </w:p>
-    <w:p>
-      <w:pPr>
-        <w:pStyle w:val="ListNumber"/>
-      </w:pPr>
+        <w:t xml:space="preserve">kyverno test</w:t>
+      </w:r>
+      <w:r>
+        <w:t xml:space="preserve"> / </w:t>
+      </w:r>
       <w:r>
         <w:rPr>
-          <w:b/>
+          <w:rFonts w:ascii="Consolas" w:hAnsi="Consolas"/>
+          <w:color w:val="CC0000"/>
+          <w:sz w:val="20"/>
         </w:rPr>
-        <w:t>Merge triggers GitOps sync</w:t>
-      </w:r>
-      <w:r>
-        <w:t xml:space="preserve"> — OpenShift GitOps (ArgoCD) syncs to</w:t>
-      </w:r>
-    </w:p>
-    <w:p>
-      <w:r>
-        <w:t xml:space="preserve">   staging cluster, smoke tests validate connectivity, then syncs to</w:t>
-      </w:r>
-    </w:p>
-    <w:p>
-      <w:r>
-        <w:t xml:space="preserve">   production.</w:t>
-      </w:r>
-    </w:p>
-    <w:p>
-      <w:pPr>
-        <w:pStyle w:val="ListNumber"/>
-      </w:pPr>
-      <w:r>
-        <w:rPr>
-          <w:b/>
-        </w:rPr>
-        <w:t>Post-deploy validation</w:t>
-      </w:r>
-      <w:r>
-        <w:t xml:space="preserve"> — ACS network graph confirms no anomalous</w:t>
-      </w:r>
-    </w:p>
-    <w:p>
-      <w:r>
-        <w:t xml:space="preserve">   flows, OVN-Kubernetes flow logs confirm deny counts are expected.</w:t>
-      </w:r>
-    </w:p>
-    <w:p>
-      <w:pPr>
-        <w:pStyle w:val="Heading3"/>
-      </w:pPr>
-      <w:r>
-        <w:t>What ACS build-time tools add</w:t>
-      </w:r>
-    </w:p>
-    <w:p>
-      <w:r>
-        <w:t>Starting with ACS 4.4, build-time network policy tools can generate and</w:t>
-      </w:r>
-    </w:p>
-    <w:p>
-      <w:r>
-        <w:t>validate policies locally or in a CI pipeline. This closes the loop between</w:t>
-      </w:r>
-    </w:p>
-    <w:p>
-      <w:r>
-        <w:t>"what traffic does my app need" (observed in ACS) and "what policy should I</w:t>
-      </w:r>
-    </w:p>
-    <w:p>
-      <w:r>
-        <w:t>write" (generated and validated in CI). The developer never needs to author</w:t>
-      </w:r>
-    </w:p>
-    <w:p>
-      <w:r>
-        <w:t>a policy from scratch — they generate one from the baseline, review it, and</w:t>
-      </w:r>
-    </w:p>
-    <w:p>
-      <w:r>
-        <w:t>submit the PR.</w:t>
-      </w:r>
-    </w:p>
-    <w:p>
-      <w:pPr>
-        <w:pStyle w:val="Heading2"/>
-      </w:pPr>
-      <w:r>
-        <w:t>5. Repo structure</w:t>
-      </w:r>
-    </w:p>
-    <w:p>
-      <w:r>
-        <w:t>Red Hat recommends a three-layer repository model that separates platform-</w:t>
-      </w:r>
-    </w:p>
-    <w:p>
-      <w:r>
-        <w:t>owned policies from application-owned policies, with clear ownership and</w:t>
-      </w:r>
-    </w:p>
-    <w:p>
-      <w:r>
-        <w:t>review boundaries.</w:t>
-      </w:r>
-    </w:p>
-    <w:p>
-      <w:pPr>
-        <w:spacing w:after="160"/>
-        <w:shd w:fill="F5F5F5" w:val="clear"/>
-      </w:pPr>
+        <w:t xml:space="preserve">gator verify</w:t>
+      </w:r>
+      <w:r>
+        <w:t xml:space="preserve"> (organizational rules: no allow-all,</w:t>
+      </w:r>
+    </w:p>
+    <w:p>
+      <w:r>
+        <w:t xml:space="preserve">     required labels, port range limits); </w:t>
+      </w:r>
       <w:r>
         <w:rPr>
           <w:rFonts w:ascii="Consolas" w:hAnsi="Consolas"/>
           <w:color w:val="333333"/>
           <w:sz w:val="18"/>
         </w:rPr>
-        <w:t>cluster-policies/</w:t>
+        <w:t xml:space="preserve">trivy config</w:t>
+      </w:r>
+      <w:r>
+        <w:t xml:space="preserve"> scans the manifests</w:t>
+      </w:r>
+    </w:p>
+    <w:p>
+      <w:pPr>
+        <w:pStyle w:val="ListBullet"/>
+      </w:pPr>
+      <w:r>
+        <w:t xml:space="preserve">Baseline diff — compare the change with the policy generated from observed flows</w:t>
+      </w:r>
+    </w:p>
+    <w:p>
+      <w:r>
+        <w:t xml:space="preserve">     and flag rules that would allow traffic outside the baseline</w:t>
+      </w:r>
+    </w:p>
+    <w:p>
+      <w:pPr>
+        <w:pStyle w:val="ListBullet"/>
+      </w:pPr>
+      <w:r>
+        <w:t xml:space="preserve">Dry-run apply — </w:t>
+      </w:r>
+      <w:r>
+        <w:rPr>
+          <w:rFonts w:ascii="Consolas" w:hAnsi="Consolas"/>
+          <w:color w:val="CC0000"/>
+          <w:sz w:val="20"/>
+        </w:rPr>
+        <w:t xml:space="preserve">kubectl apply --dry-run=server</w:t>
+      </w:r>
+      <w:r>
+        <w:t xml:space="preserve"> against a staging cluster</w:t>
+      </w:r>
+    </w:p>
+    <w:p>
+      <w:r>
+        <w:t xml:space="preserve">     (catches admission denials, quota issues)</w:t>
+      </w:r>
+    </w:p>
+    <w:p>
+      <w:pPr>
+        <w:pStyle w:val="ListNumber"/>
+      </w:pPr>
+      <w:r>
+        <w:rPr>
+          <w:b/>
+        </w:rPr>
+        <w:t>Platform / security team reviews the PR</w:t>
+      </w:r>
+      <w:r>
+        <w:t xml:space="preserve"> — CODEOWNERS enforces: app</w:t>
+      </w:r>
+    </w:p>
+    <w:p>
+      <w:r>
+        <w:t xml:space="preserve">   team authors NetworkPolicies (platform reviews), platform authors</w:t>
+      </w:r>
+    </w:p>
+    <w:p>
+      <w:r>
+        <w:t xml:space="preserve">   ClusterNetworkPolicies and egress rules (firewall/security reviews).</w:t>
+      </w:r>
+    </w:p>
+    <w:p>
+      <w:pPr>
+        <w:pStyle w:val="ListNumber"/>
+      </w:pPr>
+      <w:r>
+        <w:rPr>
+          <w:b/>
+        </w:rPr>
+        <w:t xml:space="preserve">Merge triggers GitOps sync</w:t>
+      </w:r>
+      <w:r>
+        <w:t xml:space="preserve"> — Argo CD syncs to the</w:t>
+      </w:r>
+    </w:p>
+    <w:p>
+      <w:r>
+        <w:t xml:space="preserve">   staging cluster, smoke tests validate connectivity, then syncs to</w:t>
+      </w:r>
+    </w:p>
+    <w:p>
+      <w:r>
+        <w:t xml:space="preserve">   production.</w:t>
+      </w:r>
+    </w:p>
+    <w:p>
+      <w:pPr>
+        <w:pStyle w:val="ListNumber"/>
+      </w:pPr>
+      <w:r>
+        <w:rPr>
+          <w:b/>
+        </w:rPr>
+        <w:t xml:space="preserve">Post-deploy validation</w:t>
+      </w:r>
+      <w:r>
+        <w:t xml:space="preserve"> — Hubble or Calico flow logs confirm no unexpected</w:t>
+      </w:r>
+    </w:p>
+    <w:p>
+      <w:r>
+        <w:t xml:space="preserve">   flows and the expected deny counts; Falco alerts on unexpected egress at runtime.</w:t>
+      </w:r>
+    </w:p>
+    <w:p>
+      <w:pPr>
+        <w:pStyle w:val="Heading3"/>
+      </w:pPr>
+      <w:r>
+        <w:t xml:space="preserve">What generated baselines add</w:t>
+      </w:r>
+    </w:p>
+    <w:p>
+      <w:r>
+        <w:t xml:space="preserve">Inspektor Gadget's </w:t>
+      </w:r>
+      <w:r>
+        <w:rPr>
+          <w:rFonts w:ascii="Consolas" w:hAnsi="Consolas"/>
+          <w:color w:val="333333"/>
+          <w:sz w:val="18"/>
+        </w:rPr>
+        <w:t xml:space="preserve">advise_networkpolicy</w:t>
+      </w:r>
+      <w:r>
+        <w:t xml:space="preserve"> gadget records the traffic of the</w:t>
+      </w:r>
+    </w:p>
+    <w:p>
+      <w:r>
+        <w:t xml:space="preserve">selected namespaces and writes the NetworkPolicy that matches it. This closes the loop between</w:t>
+      </w:r>
+    </w:p>
+    <w:p>
+      <w:r>
+        <w:t xml:space="preserve">"what traffic does my app need" (observed by the CNI) and "what policy should I</w:t>
+      </w:r>
+    </w:p>
+    <w:p>
+      <w:r>
+        <w:t xml:space="preserve">write" (generated, then validated in CI). The developer never needs to author</w:t>
+      </w:r>
+    </w:p>
+    <w:p>
+      <w:r>
+        <w:t>a policy from scratch — they generate one from the baseline, review it, and</w:t>
+      </w:r>
+    </w:p>
+    <w:p>
+      <w:r>
+        <w:t>submit the PR.</w:t>
+      </w:r>
+    </w:p>
+    <w:p>
+      <w:pPr>
+        <w:pStyle w:val="Heading2"/>
+      </w:pPr>
+      <w:r>
+        <w:t>5. Repo structure</w:t>
+      </w:r>
+    </w:p>
+    <w:p>
+      <w:r>
+        <w:t xml:space="preserve">A three-layer repository model separates platform-</w:t>
+      </w:r>
+    </w:p>
+    <w:p>
+      <w:r>
+        <w:t>owned policies from application-owned policies, with clear ownership and</w:t>
+      </w:r>
+    </w:p>
+    <w:p>
+      <w:r>
+        <w:t>review boundaries.</w:t>
+      </w:r>
+    </w:p>
+    <w:p>
+      <w:pPr>
+        <w:spacing w:after="160"/>
+        <w:shd w:fill="F5F5F5" w:val="clear"/>
+      </w:pPr>
+      <w:r>
+        <w:t xml:space="preserve">cluster-policies/</w:t>
         <w:br/>
-        <w:t>│</w:t>
+        <w:t xml:space="preserve">│</w:t>
         <w:br/>
-        <w:t>├── platform-baselines/                    # Platform team owns</w:t>
+        <w:t xml:space="preserve">├── platform-baselines/                    # Platform team owns</w:t>
         <w:br/>
-        <w:t>│   ├── anp/</w:t>
+        <w:t xml:space="preserve">│   ├── admin-tier/</w:t>
         <w:br/>
-        <w:t>│   │   ├── deny-cross-env.yaml           # Block dev ↔ prod traffic</w:t>
+        <w:t xml:space="preserve">│   │   ├── deny-cross-env.yaml           # Block dev ↔ prod traffic</w:t>
         <w:br/>
-        <w:t>│   │   ├── allow-monitoring.yaml         # Prometheus/OTel can scrape all pods</w:t>
+        <w:t xml:space="preserve">│   │   ├── accept-monitoring.yaml        # Prometheus/OTel can scrape all pods</w:t>
         <w:br/>
-        <w:t>│   │   ├── deny-control-plane.yaml       # Apps cannot reach API server directly</w:t>
+        <w:t xml:space="preserve">│   │   ├── deny-control-plane.yaml       # Apps cannot reach API server directly</w:t>
         <w:br/>
-        <w:t>│   │   └── pass-app-traffic.yaml         # Delegate app-to-app decisions to NP tier</w:t>
+        <w:t xml:space="preserve">│   │   └── pass-app-traffic.yaml         # Delegate app-to-app decisions to NP tier</w:t>
         <w:br/>
-        <w:t>│   ├── banp/</w:t>
+        <w:t xml:space="preserve">│   ├── baseline-tier/</w:t>
         <w:br/>
-        <w:t>│   │   └── default-deny-baseline.yaml    # Safety net: deny anything not explicitly allowed</w:t>
+        <w:t xml:space="preserve">│   │   └── default-deny-baseline.yaml    # Safety net: deny anything not explicitly allowed</w:t>
         <w:br/>
-        <w:t>│   ├── egressfirewall/</w:t>
+        <w:t xml:space="preserve">│   ├── egress/</w:t>
         <w:br/>
-        <w:t>│   │   ├── prod-egress.yaml              # Production: allow only approved external CIDRs/DNS</w:t>
+        <w:t xml:space="preserve">│   │   ├── prod-egress.yaml              # Production: allow only approved external CIDRs/DNS</w:t>
         <w:br/>
-        <w:t>│   │   ├── test-egress.yaml              # Test: same as prod (mirrors topology)</w:t>
+        <w:t xml:space="preserve">│   │   ├── test-egress.yaml              # Test: same as prod (mirrors topology)</w:t>
         <w:br/>
-        <w:t>│   │   └── dev-egress.yaml               # Dev: broader access, still no direct internet</w:t>
+        <w:t xml:space="preserve">│   │   └── dev-egress.yaml               # Dev: broader access, still no direct internet</w:t>
         <w:br/>
-        <w:t>│   └── kustomization.yaml</w:t>
+        <w:t xml:space="preserve">│   └── kustomization.yaml</w:t>
         <w:br/>
-        <w:t>│</w:t>
+        <w:t xml:space="preserve">│</w:t>
         <w:br/>
-        <w:t>├── onboarding/                            # Platform team maintains, app teams consume</w:t>
+        <w:t xml:space="preserve">├── onboarding/                            # Platform team maintains, app teams consume</w:t>
         <w:br/>
-        <w:t>│   ├── web-service/</w:t>
+        <w:t xml:space="preserve">│   ├── web-service/</w:t>
         <w:br/>
-        <w:t>│   │   ├── default-deny.yaml</w:t>
+        <w:t xml:space="preserve">│   │   ├── default-deny.yaml</w:t>
         <w:br/>
-        <w:t>│   │   ├── allow-ingress-controller.yaml</w:t>
+        <w:t xml:space="preserve">│   │   ├── allow-ingress-controller.yaml</w:t>
         <w:br/>
-        <w:t>│   │   ├── allow-egress-db.yaml</w:t>
+        <w:t xml:space="preserve">│   │   ├── allow-egress-db.yaml</w:t>
         <w:br/>
-        <w:t>│   │   └── kustomization.yaml</w:t>
+        <w:t xml:space="preserve">│   │   └── kustomization.yaml</w:t>
         <w:br/>
-        <w:t>│   ├── internal-api/</w:t>
+        <w:t xml:space="preserve">│   ├── internal-api/</w:t>
         <w:br/>
-        <w:t>│   │   ├── default-deny.yaml</w:t>
+        <w:t xml:space="preserve">│   │   ├── default-deny.yaml</w:t>
         <w:br/>
-        <w:t>│   │   ├── allow-from-consumers.yaml</w:t>
+        <w:t xml:space="preserve">│   │   ├── allow-from-consumers.yaml</w:t>
         <w:br/>
-        <w:t>│   │   ├── allow-egress-kafka.yaml</w:t>
+        <w:t xml:space="preserve">│   │   ├── allow-egress-kafka.yaml</w:t>
         <w:br/>
-        <w:t>│   │   └── kustomization.yaml</w:t>
+        <w:t xml:space="preserve">│   │   └── kustomization.yaml</w:t>
         <w:br/>
-        <w:t>│   └── batch-job/</w:t>
+        <w:t xml:space="preserve">│   └── batch-job/</w:t>
         <w:br/>
-        <w:t>│       ├── default-deny.yaml</w:t>
+        <w:t xml:space="preserve">│       ├── default-deny.yaml</w:t>
         <w:br/>
-        <w:t>│       ├── allow-egress-db.yaml</w:t>
+        <w:t xml:space="preserve">│       ├── allow-egress-db.yaml</w:t>
         <w:br/>
-        <w:t>│       └── kustomization.yaml</w:t>
+        <w:t xml:space="preserve">│       └── kustomization.yaml</w:t>
         <w:br/>
-        <w:t>│</w:t>
+        <w:t xml:space="preserve">│</w:t>
         <w:br/>
-        <w:t>├── app-policies/                          # App teams own, platform reviews</w:t>
+        <w:t xml:space="preserve">├── app-policies/                          # App teams own, platform reviews</w:t>
         <w:br/>
-        <w:t>│   ├── orders/</w:t>
+        <w:t xml:space="preserve">│   ├── orders/</w:t>
         <w:br/>
-        <w:t>│   │   ├── base/</w:t>
+        <w:t xml:space="preserve">│   │   ├── base/</w:t>
         <w:br/>
-        <w:t>│   │   │   ├── order-service-np.yaml</w:t>
+        <w:t xml:space="preserve">│   │   │   ├── order-service-np.yaml</w:t>
         <w:br/>
-        <w:t>│   │   │   ├── inventory-service-np.yaml</w:t>
+        <w:t xml:space="preserve">│   │   │   ├── inventory-service-np.yaml</w:t>
         <w:br/>
-        <w:t>│   │   │   └── kustomization.yaml</w:t>
+        <w:t xml:space="preserve">│   │   │   └── kustomization.yaml</w:t>
         <w:br/>
-        <w:t>│   │   └── overlays/</w:t>
+        <w:t xml:space="preserve">│   │   └── overlays/</w:t>
         <w:br/>
-        <w:t>│   │       ├── dev/</w:t>
+        <w:t xml:space="preserve">│   │       ├── dev/</w:t>
         <w:br/>
-        <w:t>│   │       ├── test/</w:t>
+        <w:t xml:space="preserve">│   │       ├── test/</w:t>
         <w:br/>
-        <w:t>│   │       └── prod/</w:t>
+        <w:t xml:space="preserve">│   │       └── prod/</w:t>
         <w:br/>
-        <w:t>│   ├── payments/</w:t>
+        <w:t xml:space="preserve">│   ├── payments/</w:t>
         <w:br/>
-        <w:t>│   │   └── ...</w:t>
+        <w:t xml:space="preserve">│   │   └── ...</w:t>
         <w:br/>
-        <w:t>│   └── notifications/</w:t>
+        <w:t xml:space="preserve">│   └── notifications/</w:t>
         <w:br/>
-        <w:t>│       └── ...</w:t>
+        <w:t xml:space="preserve">│       └── ...</w:t>
         <w:br/>
-        <w:t>│</w:t>
+        <w:t xml:space="preserve">│</w:t>
         <w:br/>
-        <w:t>├── CODEOWNERS                             # Enforces review rules</w:t>
+        <w:t xml:space="preserve">├── CODEOWNERS                             # Enforces review rules</w:t>
         <w:br/>
-        <w:t>│   # /platform-baselines/  @platform-team @firewall-team</w:t>
+        <w:t xml:space="preserve">│   # /platform-baselines/  @platform-team @firewall-team</w:t>
         <w:br/>
-        <w:t>│   # /onboarding/          @platform-team</w:t>
+        <w:t xml:space="preserve">│   # /onboarding/          @platform-team</w:t>
         <w:br/>
-        <w:t>│   # /app-policies/orders/ @orders-team   @platform-team</w:t>
+        <w:t xml:space="preserve">│   # /app-policies/orders/ @orders-team   @platform-team</w:t>
         <w:br/>
-        <w:t>│</w:t>
+        <w:t xml:space="preserve">│</w:t>
         <w:br/>
-        <w:t>└── .tekton/ or .github/                   # CI pipeline definitions</w:t>
+        <w:t xml:space="preserve">└── .tekton/ or .github/                   # CI pipeline definitions</w:t>
         <w:br/>
         <w:t xml:space="preserve">    └── policy-validation.yaml</w:t>
       </w:r>
@@ -1830,7 +2007,7 @@
           </w:tcPr>
           <w:p>
             <w:r>
-              <w:t>`platform-baselines/` (ANP, BANP, EgressFirewall)</w:t>
+              <w:t xml:space="preserve">`platform-baselines/` (Admin tier, Baseline tier, egress rules)</w:t>
             </w:r>
           </w:p>
         </w:tc>
@@ -2018,20 +2195,20 @@
         <w:rPr>
           <w:b/>
         </w:rPr>
-        <w:t>ACS anomalous flow alerts</w:t>
-      </w:r>
-      <w:r>
-        <w:t xml:space="preserve"> — check the ACS network graph for the</w:t>
-      </w:r>
-    </w:p>
-    <w:p>
-      <w:r>
-        <w:t xml:space="preserve">   deployment. If the connection appears as an anomalous flow (outside the</w:t>
-      </w:r>
-    </w:p>
-    <w:p>
-      <w:r>
-        <w:t xml:space="preserve">   baseline), it was likely never policy-allowed. Decide whether to add</w:t>
+        <w:t xml:space="preserve">Compare with the baseline</w:t>
+      </w:r>
+      <w:r>
+        <w:t xml:space="preserve"> — check whether the connection is in the</w:t>
+      </w:r>
+    </w:p>
+    <w:p>
+      <w:r>
+        <w:t xml:space="preserve">   observed baseline (the generated policies in Git). If it is not, it was</w:t>
+      </w:r>
+    </w:p>
+    <w:p>
+      <w:r>
+        <w:t xml:space="preserve">   likely never policy-allowed. Decide whether to add</w:t>
       </w:r>
     </w:p>
     <w:p>
@@ -2047,29 +2224,42 @@
         <w:rPr>
           <w:b/>
         </w:rPr>
-        <w:t>OVN-Kubernetes flow logs</w:t>
-      </w:r>
-      <w:r>
-        <w:t xml:space="preserve"> — OVN-K logs denied packets with source pod,</w:t>
-      </w:r>
-    </w:p>
-    <w:p>
-      <w:r>
-        <w:t xml:space="preserve">   destination, port, and the ACL rule that denied them. These logs</w:t>
-      </w:r>
-    </w:p>
-    <w:p>
-      <w:r>
-        <w:t xml:space="preserve">   identify </w:t>
+        <w:t xml:space="preserve">Flow logs</w:t>
+      </w:r>
+      <w:r>
+        <w:t xml:space="preserve"> — </w:t>
+      </w:r>
+      <w:r>
+        <w:rPr>
+          <w:rFonts w:ascii="Consolas" w:hAnsi="Consolas"/>
+          <w:color w:val="333333"/>
+          <w:sz w:val="18"/>
+        </w:rPr>
+        <w:t xml:space="preserve">hubble observe --verdict DROPPED</w:t>
+      </w:r>
+      <w:r>
+        <w:t xml:space="preserve"> (Cilium) or the Calico</w:t>
+      </w:r>
+    </w:p>
+    <w:p>
+      <w:r>
+        <w:t xml:space="preserve">   flow logs show the dropped flow with source pod, destination and port.</w:t>
+      </w:r>
+    </w:p>
+    <w:p>
+      <w:r>
+        <w:t xml:space="preserve">   Match it with the policies that select the pod to find </w:t>
       </w:r>
       <w:r>
         <w:rPr>
           <w:i/>
         </w:rPr>
-        <w:t>which tier</w:t>
-      </w:r>
-      <w:r>
-        <w:t xml:space="preserve"> denied the traffic (ANP, NP, or BANP), which</w:t>
+        <w:t xml:space="preserve">which tier</w:t>
+      </w:r>
+    </w:p>
+    <w:p>
+      <w:r>
+        <w:t xml:space="preserve">   denied the traffic (Admin, NP, or Baseline), which</w:t>
       </w:r>
     </w:p>
     <w:p>
@@ -2085,20 +2275,44 @@
         <w:rPr>
           <w:b/>
         </w:rPr>
-        <w:t>`oc adm must-gather`</w:t>
-      </w:r>
-      <w:r>
-        <w:t xml:space="preserve"> — collects network policy state, OVN-K</w:t>
-      </w:r>
-    </w:p>
-    <w:p>
-      <w:r>
-        <w:t xml:space="preserve">   configuration, and flow logs for offline analysis. Use this for</w:t>
-      </w:r>
-    </w:p>
-    <w:p>
-      <w:r>
-        <w:t xml:space="preserve">   escalation to Red Hat support.</w:t>
+        <w:t xml:space="preserve">Diagnostics bundle</w:t>
+      </w:r>
+      <w:r>
+        <w:t xml:space="preserve"> — </w:t>
+      </w:r>
+      <w:r>
+        <w:rPr>
+          <w:rFonts w:ascii="Consolas" w:hAnsi="Consolas"/>
+          <w:color w:val="333333"/>
+          <w:sz w:val="18"/>
+        </w:rPr>
+        <w:t xml:space="preserve">cilium sysdump</w:t>
+      </w:r>
+      <w:r>
+        <w:t xml:space="preserve"> or </w:t>
+      </w:r>
+      <w:r>
+        <w:rPr>
+          <w:rFonts w:ascii="Consolas" w:hAnsi="Consolas"/>
+          <w:color w:val="333333"/>
+          <w:sz w:val="18"/>
+        </w:rPr>
+        <w:t xml:space="preserve">calicoctl cluster diags</w:t>
+      </w:r>
+    </w:p>
+    <w:p>
+      <w:r>
+        <w:t xml:space="preserve">   collects network policy state, CNI configuration, and logs for offline</w:t>
+      </w:r>
+    </w:p>
+    <w:p>
+      <w:r>
+        <w:t xml:space="preserve">   analysis. Use it for an upstream issue or for escalation to your support</w:t>
+      </w:r>
+    </w:p>
+    <w:p>
+      <w:r>
+        <w:t xml:space="preserve">   provider.</w:t>
       </w:r>
     </w:p>
     <w:p>
@@ -2114,7 +2328,7 @@
     </w:p>
     <w:p>
       <w:r>
-        <w:t>regularly takes longer, the observability tooling (ACS, flow logs) is not</w:t>
+        <w:t xml:space="preserve">regularly takes longer, the observability tooling (flow logs, baselines) is not</w:t>
       </w:r>
     </w:p>
     <w:p>
@@ -2151,7 +2365,7 @@
         <w:rPr>
           <w:b/>
         </w:rPr>
-        <w:t>temporary ANP with a Pass rule</w:t>
+        <w:t xml:space="preserve">temporary Admin-tier policy with a Pass rule</w:t>
       </w:r>
       <w:r>
         <w:t xml:space="preserve"> at a</w:t>
@@ -2164,12 +2378,12 @@
     </w:p>
     <w:p>
       <w:r>
-        <w:t xml:space="preserve">   NetworkPolicy tier. If no NetworkPolicy exists for the target, the BANP</w:t>
-      </w:r>
-    </w:p>
-    <w:p>
-      <w:r>
-        <w:t xml:space="preserve">   (if configured as default-deny) will still deny — so the break-glass</w:t>
+        <w:t xml:space="preserve">   NetworkPolicy tier. If no NetworkPolicy exists for the target, the Baseline tier</w:t>
+      </w:r>
+    </w:p>
+    <w:p>
+      <w:r>
+        <w:t xml:space="preserve">   (if configured as default-deny) will still deny, so the break-glass</w:t>
       </w:r>
     </w:p>
     <w:p>
@@ -2250,7 +2464,7 @@
         <w:rPr>
           <w:b/>
         </w:rPr>
-        <w:t>OpenShift GitOps (ArgoCD)</w:t>
+        <w:t xml:space="preserve">Argo CD</w:t>
       </w:r>
       <w:r>
         <w:t xml:space="preserve"> reports sync status for every policy</w:t>
@@ -2266,7 +2480,7 @@
           <w:color w:val="CC0000"/>
           <w:sz w:val="20"/>
         </w:rPr>
-        <w:t>oc apply</w:t>
+        <w:t xml:space="preserve">kubectl apply</w:t>
       </w:r>
       <w:r>
         <w:t xml:space="preserve"> instead</w:t>
@@ -2274,12 +2488,12 @@
     </w:p>
     <w:p>
       <w:r>
-        <w:t xml:space="preserve">  of the PR pipeline, ArgoCD detects the drift and either alerts or</w:t>
-      </w:r>
-    </w:p>
-    <w:p>
-      <w:r>
-        <w:t xml:space="preserve">  auto-reverts (depending on configuration).</w:t>
+        <w:t xml:space="preserve">  of the PR pipeline, Argo CD detects the drift and either alerts or</w:t>
+      </w:r>
+    </w:p>
+    <w:p>
+      <w:r>
+        <w:t xml:space="preserve">  auto-reverts (self-heal, depending on configuration).</w:t>
       </w:r>
     </w:p>
     <w:p>
@@ -2290,7 +2504,7 @@
         <w:rPr>
           <w:b/>
         </w:rPr>
-        <w:t>ACS baseline drift</w:t>
+        <w:t xml:space="preserve">Baseline drift</w:t>
       </w:r>
       <w:r>
         <w:t xml:space="preserve"> — if new traffic flows appear that are not in</w:t>
@@ -2298,7 +2512,7 @@
     </w:p>
     <w:p>
       <w:r>
-        <w:t xml:space="preserve">  the ACS network baseline, ACS flags them as anomalous. This catches</w:t>
+        <w:t xml:space="preserve">  the observed baseline, the flow logs and Falco flag them. This catches</w:t>
       </w:r>
     </w:p>
     <w:p>
@@ -2337,7 +2551,7 @@
         <w:pStyle w:val="ListBullet"/>
       </w:pPr>
       <w:r>
-        <w:t>Namespaces with ACS baselines active vs. those still in observation.</w:t>
+        <w:t xml:space="preserve">Namespaces with reviewed baselines vs. those still in observation.</w:t>
       </w:r>
     </w:p>
     <w:p>
@@ -2345,7 +2559,7 @@
         <w:pStyle w:val="ListBullet"/>
       </w:pPr>
       <w:r>
-        <w:t>ANP/BANP rules in effect and their last-modified dates.</w:t>
+        <w:t xml:space="preserve">Admin-tier and Baseline-tier rules in effect and their last-modified dates.</w:t>
       </w:r>
     </w:p>
     <w:p>
@@ -2379,7 +2593,7 @@
     </w:p>
     <w:p>
       <w:r>
-        <w:t>It changes their scope and elevates their role from gatekeeper to architect.</w:t>
+        <w:t xml:space="preserve">It changes their scope and moves their role from gatekeeper to architect.</w:t>
       </w:r>
     </w:p>
     <w:p>
@@ -2398,10 +2612,10 @@
         <w:rPr>
           <w:b/>
         </w:rPr>
-        <w:t>North-south edge controls</w:t>
-      </w:r>
-      <w:r>
-        <w:t xml:space="preserve"> — the perimeter firewall (Palo Alto)</w:t>
+        <w:t xml:space="preserve">North-south edge controls</w:t>
+      </w:r>
+      <w:r>
+        <w:t xml:space="preserve"> — the perimeter firewall</w:t>
       </w:r>
     </w:p>
     <w:p>
@@ -2427,7 +2641,7 @@
         <w:rPr>
           <w:b/>
         </w:rPr>
-        <w:t>EgressFirewall authorship</w:t>
+        <w:t xml:space="preserve">Egress rule authorship</w:t>
       </w:r>
       <w:r>
         <w:t xml:space="preserve"> — the firewall team authors and reviews</w:t>
@@ -2435,7 +2649,7 @@
     </w:p>
     <w:p>
       <w:r>
-        <w:t xml:space="preserve">  EgressFirewall CRDs that control which external destinations cluster</w:t>
+        <w:t xml:space="preserve">  the egress rules that control which external destinations cluster</w:t>
       </w:r>
     </w:p>
     <w:p>
@@ -2456,7 +2670,7 @@
         <w:rPr>
           <w:b/>
         </w:rPr>
-        <w:t>ANP / BANP review</w:t>
+        <w:t xml:space="preserve">Admin and Baseline tier review</w:t>
       </w:r>
       <w:r>
         <w:t xml:space="preserve"> — the firewall team reviews all cluster-scoped</w:t>
@@ -2464,7 +2678,7 @@
     </w:p>
     <w:p>
       <w:r>
-        <w:t xml:space="preserve">  network policies (ANP, BANP) because these have cluster-wide blast</w:t>
+        <w:t xml:space="preserve">  network policies (the Admin and Baseline tiers) because these have cluster-wide blast</w:t>
       </w:r>
     </w:p>
     <w:p>
@@ -2662,7 +2876,7 @@
     </w:p>
     <w:p>
       <w:r>
-        <w:t xml:space="preserve">      default-deny NetworkPolicy or BANP coverage.</w:t>
+        <w:t xml:space="preserve">      default-deny NetworkPolicy or Baseline-tier coverage.</w:t>
       </w:r>
     </w:p>
     <w:p>
@@ -2670,12 +2884,18 @@
         <w:pStyle w:val="ListBullet"/>
       </w:pPr>
       <w:r>
-        <w:t>ACS baselines active — every production namespace has a locked</w:t>
-      </w:r>
-    </w:p>
-    <w:p>
-      <w:r>
-        <w:t xml:space="preserve">      baseline. New flows trigger anomalous-flow alerts.</w:t>
+        <w:rPr>
+          <w:b/>
+        </w:rPr>
+        <w:t xml:space="preserve">Baselines reviewed</w:t>
+      </w:r>
+      <w:r>
+        <w:t xml:space="preserve"> — every production namespace has a reviewed</w:t>
+      </w:r>
+    </w:p>
+    <w:p>
+      <w:r>
+        <w:t xml:space="preserve">      baseline in Git. New flows outside it raise alerts.</w:t>
       </w:r>
     </w:p>
     <w:p>
@@ -2683,7 +2903,13 @@
         <w:pStyle w:val="ListBullet"/>
       </w:pPr>
       <w:r>
-        <w:t>ANP guardrails enforced — cross-environment traffic blocked,</w:t>
+        <w:rPr>
+          <w:b/>
+        </w:rPr>
+        <w:t xml:space="preserve">Admin-tier guardrails enforced</w:t>
+      </w:r>
+      <w:r>
+        <w:t xml:space="preserve"> — cross-environment traffic blocked,</w:t>
       </w:r>
     </w:p>
     <w:p>
@@ -2696,12 +2922,18 @@
         <w:pStyle w:val="ListBullet"/>
       </w:pPr>
       <w:r>
-        <w:t>BANP default-deny — the cluster-wide safety net catches any</w:t>
-      </w:r>
-    </w:p>
-    <w:p>
-      <w:r>
-        <w:t xml:space="preserve">      traffic not explicitly allowed by ANP or NetworkPolicy.</w:t>
+        <w:rPr>
+          <w:b/>
+        </w:rPr>
+        <w:t xml:space="preserve">Baseline-tier default-deny</w:t>
+      </w:r>
+      <w:r>
+        <w:t xml:space="preserve"> — the cluster-wide safety net catches any</w:t>
+      </w:r>
+    </w:p>
+    <w:p>
+      <w:r>
+        <w:t xml:space="preserve">      traffic not explicitly allowed by the Admin tier or NetworkPolicy.</w:t>
       </w:r>
     </w:p>
     <w:p>
@@ -2722,117 +2954,141 @@
           <w:color w:val="CC0000"/>
           <w:sz w:val="20"/>
         </w:rPr>
-        <w:t>oc apply</w:t>
-      </w:r>
-      <w:r>
-        <w:t>.</w:t>
+        <w:t xml:space="preserve">kubectl apply</w:t>
+      </w:r>
+      <w:r>
+        <w:t xml:space="preserve">.</w:t>
       </w:r>
     </w:p>
     <w:p>
       <w:pPr>
         <w:pStyle w:val="ListBullet"/>
-      </w:pPr>
-      <w:r>
-        <w:t>CI validates before merge — schema checks, policy linting, ACS</w:t>
-      </w:r>
-    </w:p>
-    <w:p>
-      <w:r>
-        <w:t xml:space="preserve">      build-time validation, and dry-run apply run on every PR.</w:t>
-      </w:r>
-    </w:p>
-    <w:p>
-      <w:pPr>
-        <w:pStyle w:val="ListBullet"/>
-      </w:pPr>
-      <w:r>
-        <w:t>EgressFirewall per project — outbound traffic is restricted to</w:t>
-      </w:r>
-    </w:p>
-    <w:p>
-      <w:r>
-        <w:t xml:space="preserve">      approved external destinations in every namespace.</w:t>
-      </w:r>
-    </w:p>
-    <w:p>
-      <w:pPr>
-        <w:pStyle w:val="ListBullet"/>
-      </w:pPr>
-      <w:r>
-        <w:t>Firewall team reviews, does not block — turnaround on ANP/BANP</w:t>
-      </w:r>
-    </w:p>
-    <w:p>
-      <w:r>
-        <w:t xml:space="preserve">      reviews is under 48 hours.</w:t>
-      </w:r>
-    </w:p>
-    <w:p>
-      <w:pPr>
-        <w:pStyle w:val="ListBullet"/>
-      </w:pPr>
-      <w:r>
-        <w:t>Denied-flow triage under 30 minutes — ACS alerts and OVN-K flow</w:t>
-      </w:r>
-    </w:p>
-    <w:p>
-      <w:r>
-        <w:t xml:space="preserve">      logs provide immediate root-cause.</w:t>
-      </w:r>
-    </w:p>
-    <w:p>
-      <w:pPr>
-        <w:pStyle w:val="ListBullet"/>
-      </w:pPr>
-      <w:r>
-        <w:t>Quarterly policy review — all break-glass events reviewed,</w:t>
-      </w:r>
-    </w:p>
-    <w:p>
-      <w:r>
-        <w:t xml:space="preserve">      stale policies removed, ACS baselines refreshed, RBAC bindings</w:t>
-      </w:r>
-    </w:p>
-    <w:p>
-      <w:r>
-        <w:t xml:space="preserve">      audited.</w:t>
-      </w:r>
-    </w:p>
-    <w:p>
-      <w:pPr>
-        <w:pStyle w:val="Heading3"/>
-      </w:pPr>
-      <w:r>
-        <w:t>What customers wish they'd done differently</w:t>
-      </w:r>
-    </w:p>
-    <w:p>
-      <w:r>
-        <w:t>These are the top five lessons Red Hat hears from customers who have</w:t>
-      </w:r>
-    </w:p>
-    <w:p>
-      <w:r>
-        <w:t>completed this journey:</w:t>
-      </w:r>
-    </w:p>
-    <w:p>
-      <w:pPr>
-        <w:pStyle w:val="ListNumber"/>
       </w:pPr>
       <w:r>
         <w:rPr>
           <w:b/>
         </w:rPr>
-        <w:t>"We should have started with observation, not enforcement."</w:t>
-      </w:r>
-      <w:r>
-        <w:t xml:space="preserve"> Customers</w:t>
-      </w:r>
-    </w:p>
-    <w:p>
-      <w:r>
-        <w:t xml:space="preserve">   who jumped to default-deny without first running ACS in observation mode</w:t>
+        <w:t xml:space="preserve">CI validates before merge</w:t>
+      </w:r>
+      <w:r>
+        <w:t xml:space="preserve"> — schema checks, policy linting, baseline</w:t>
+      </w:r>
+    </w:p>
+    <w:p>
+      <w:r>
+        <w:t xml:space="preserve">      diff, and dry-run apply run on every PR.</w:t>
+      </w:r>
+    </w:p>
+    <w:p>
+      <w:pPr>
+        <w:pStyle w:val="ListBullet"/>
+      </w:pPr>
+      <w:r>
+        <w:rPr>
+          <w:b/>
+        </w:rPr>
+        <w:t xml:space="preserve">Egress rules per namespace</w:t>
+      </w:r>
+      <w:r>
+        <w:t xml:space="preserve"> — outbound traffic is restricted to</w:t>
+      </w:r>
+    </w:p>
+    <w:p>
+      <w:r>
+        <w:t xml:space="preserve">      approved external destinations in every namespace.</w:t>
+      </w:r>
+    </w:p>
+    <w:p>
+      <w:pPr>
+        <w:pStyle w:val="ListBullet"/>
+      </w:pPr>
+      <w:r>
+        <w:rPr>
+          <w:b/>
+        </w:rPr>
+        <w:t xml:space="preserve">Firewall team reviews, does not block</w:t>
+      </w:r>
+      <w:r>
+        <w:t xml:space="preserve"> — turnaround on Admin and Baseline tier</w:t>
+      </w:r>
+    </w:p>
+    <w:p>
+      <w:r>
+        <w:t xml:space="preserve">      reviews is under 48 hours.</w:t>
+      </w:r>
+    </w:p>
+    <w:p>
+      <w:pPr>
+        <w:pStyle w:val="ListBullet"/>
+      </w:pPr>
+      <w:r>
+        <w:rPr>
+          <w:b/>
+        </w:rPr>
+        <w:t xml:space="preserve">Denied-flow triage under 30 minutes</w:t>
+      </w:r>
+      <w:r>
+        <w:t xml:space="preserve"> — flow logs and Falco alerts</w:t>
+      </w:r>
+    </w:p>
+    <w:p>
+      <w:r>
+        <w:t xml:space="preserve">      provide immediate root-cause.</w:t>
+      </w:r>
+    </w:p>
+    <w:p>
+      <w:pPr>
+        <w:pStyle w:val="ListBullet"/>
+      </w:pPr>
+      <w:r>
+        <w:t>Quarterly policy review — all break-glass events reviewed,</w:t>
+      </w:r>
+    </w:p>
+    <w:p>
+      <w:r>
+        <w:t xml:space="preserve">      stale policies removed, baselines refreshed, RBAC bindings</w:t>
+      </w:r>
+    </w:p>
+    <w:p>
+      <w:r>
+        <w:t xml:space="preserve">      audited.</w:t>
+      </w:r>
+    </w:p>
+    <w:p>
+      <w:pPr>
+        <w:pStyle w:val="Heading3"/>
+      </w:pPr>
+      <w:r>
+        <w:t xml:space="preserve">What organizations wish they'd done differently</w:t>
+      </w:r>
+    </w:p>
+    <w:p>
+      <w:r>
+        <w:t xml:space="preserve">These are the five lessons heard most often from organizations that have</w:t>
+      </w:r>
+    </w:p>
+    <w:p>
+      <w:r>
+        <w:t xml:space="preserve">completed this transition:</w:t>
+      </w:r>
+    </w:p>
+    <w:p>
+      <w:pPr>
+        <w:pStyle w:val="ListNumber"/>
+      </w:pPr>
+      <w:r>
+        <w:rPr>
+          <w:b/>
+        </w:rPr>
+        <w:t xml:space="preserve">"We should have started with observation, not enforcement."</w:t>
+      </w:r>
+      <w:r>
+        <w:t xml:space="preserve"> Teams</w:t>
+      </w:r>
+    </w:p>
+    <w:p>
+      <w:r>
+        <w:t xml:space="preserve">   that jumped to default-deny without first observing the flows</w:t>
       </w:r>
     </w:p>
     <w:p>
@@ -2877,7 +3133,7 @@
         <w:rPr>
           <w:b/>
         </w:rPr>
-        <w:t>"We underestimated the EgressFirewall work."</w:t>
+        <w:t xml:space="preserve">"We underestimated the egress work."</w:t>
       </w:r>
       <w:r>
         <w:t xml:space="preserve"> Cataloging every</w:t>
@@ -2895,7 +3151,7 @@
     </w:p>
     <w:p>
       <w:r>
-        <w:t xml:space="preserve">   alongside the ACS observation.</w:t>
+        <w:t xml:space="preserve">   alongside the flow observation.</w:t>
       </w:r>
     </w:p>
     <w:p>
@@ -2906,10 +3162,10 @@
         <w:rPr>
           <w:b/>
         </w:rPr>
-        <w:t>"We should have involved the firewall team earlier."</w:t>
-      </w:r>
-      <w:r>
-        <w:t xml:space="preserve"> Customers who</w:t>
+        <w:t xml:space="preserve">"We should have involved the firewall team earlier."</w:t>
+      </w:r>
+      <w:r>
+        <w:t xml:space="preserve"> Teams that</w:t>
       </w:r>
     </w:p>
     <w:p>
@@ -2919,7 +3175,7 @@
     </w:p>
     <w:p>
       <w:r>
-        <w:t xml:space="preserve">   resistance. Customers who positioned it as "the firewall team's</w:t>
+        <w:t xml:space="preserve">   resistance. Teams that positioned it as "the firewall team's</w:t>
       </w:r>
     </w:p>
     <w:p>
@@ -3053,7 +3309,7 @@
           </w:tcPr>
           <w:p>
             <w:r>
-              <w:t>NetworkPolicy, ANP, BANP, EgressFirewall — the focus here</w:t>
+              <w:t xml:space="preserve">NetworkPolicy, ClusterNetworkPolicy (Admin and Baseline tiers), egress rules: the focus here</w:t>
             </w:r>
           </w:p>
         </w:tc>
@@ -3149,7 +3405,7 @@
           </w:tcPr>
           <w:p>
             <w:r>
-              <w:t>ArgoCD sync and drift detection for policies</w:t>
+              <w:t xml:space="preserve">Argo CD sync and drift detection for policies</w:t>
             </w:r>
           </w:p>
         </w:tc>
@@ -3181,7 +3437,7 @@
           </w:tcPr>
           <w:p>
             <w:r>
-              <w:t>ACS baselines, OVN-K flow logs, break-glass tracking</w:t>
+              <w:t xml:space="preserve">Flow logs, Falco alerts, break-glass tracking</w:t>
             </w:r>
           </w:p>
         </w:tc>
@@ -3266,7 +3522,7 @@
           <w:color w:val="0066CC"/>
           <w:u w:val="single"/>
         </w:rPr>
-        <w:t>OpenShift AdminNetworkPolicy documentation</w:t>
+        <w:t xml:space="preserve">Kubernetes Network Policy API: ClusterNetworkPolicy</w:t>
       </w:r>
     </w:p>
     <w:p>
@@ -3278,7 +3534,7 @@
           <w:color w:val="0066CC"/>
           <w:u w:val="single"/>
         </w:rPr>
-        <w:t>BaselineAdminNetworkPolicy documentation</w:t>
+        <w:t xml:space="preserve">network-policy-api v0.2.0 release notes</w:t>
       </w:r>
     </w:p>
     <w:p>
@@ -3290,7 +3546,7 @@
           <w:color w:val="0066CC"/>
           <w:u w:val="single"/>
         </w:rPr>
-        <w:t>Using AdminNetworkPolicy API to secure OpenShift cluster networking</w:t>
+        <w:t xml:space="preserve">Network Policy API implementations</w:t>
       </w:r>
     </w:p>
     <w:p>
@@ -3302,7 +3558,7 @@
           <w:color w:val="0066CC"/>
           <w:u w:val="single"/>
         </w:rPr>
-        <w:t>OpenShift EgressFirewall documentation</w:t>
+        <w:t xml:space="preserve">Calico v3.32 release notes: ClusterNetworkPolicy</w:t>
       </w:r>
     </w:p>
     <w:p>
@@ -3314,7 +3570,23 @@
           <w:color w:val="0066CC"/>
           <w:u w:val="single"/>
         </w:rPr>
-        <w:t>ACS — Managing network policies</w:t>
+        <w:t xml:space="preserve">Cilium: Kubernetes network policy</w:t>
+      </w:r>
+    </w:p>
+    <w:p>
+      <w:pPr>
+        <w:pStyle w:val="ListBullet"/>
+      </w:pPr>
+      <w:r>
+        <w:t xml:space="preserve">Inspektor Gadget: advise_networkpolicy</w:t>
+      </w:r>
+    </w:p>
+    <w:p>
+      <w:pPr>
+        <w:pStyle w:val="ListBullet"/>
+      </w:pPr>
+      <w:r>
+        <w:t xml:space="preserve">Kyverno policy: add-network-policy</w:t>
       </w:r>
     </w:p>
     <w:p>

</xml_diff>